<commit_message>
adding folders and cards to UI
</commit_message>
<xml_diff>
--- a/card_organizer/critical_thinking.docx
+++ b/card_organizer/critical_thinking.docx
@@ -39,6 +39,131 @@
       </w:r>
       <w:r>
         <w:t xml:space="preserve"> We also have cleaner UI code when it only contains UI-related code without database and business logic causing clutter and confusion.</w:t>
+      </w:r>
+    </w:p>
+    <w:p>
+      <w:pPr>
+        <w:pStyle w:val="ListParagraph"/>
+        <w:numPr>
+          <w:ilvl w:val="0"/>
+          <w:numId w:val="1"/>
+        </w:numPr>
+      </w:pPr>
+      <w:r>
+        <w:t xml:space="preserve">ON DELETE CASCADE </w:t>
+      </w:r>
+      <w:r>
+        <w:t>deletes all the cards associated with a folder when a folder is deleted. This matters because, without it, if a folder were to be deleted, the cards would stay in our database, introducing clutter even though they would never be used. The users might not see an impact immediately, but as the database grows and new cards are added to folders and folders are deleted, the performance could worsen.</w:t>
+      </w:r>
+    </w:p>
+    <w:p>
+      <w:pPr>
+        <w:pStyle w:val="ListParagraph"/>
+        <w:numPr>
+          <w:ilvl w:val="0"/>
+          <w:numId w:val="1"/>
+        </w:numPr>
+      </w:pPr>
+      <w:r>
+        <w:t>To add a new column, I would use the onUpgrade callback provided by sqflite. First, we bump the version number, add an upgradeDB handler that contains our changes, update createDB for fresh installs. For rollbacks and a testing plan, we would unit test the migration, test a fresh install to ensure the new schema has been applied, and keep a copy of the v1 .db files.</w:t>
+      </w:r>
+    </w:p>
+    <w:p>
+      <w:pPr>
+        <w:pStyle w:val="ListParagraph"/>
+        <w:numPr>
+          <w:ilvl w:val="0"/>
+          <w:numId w:val="1"/>
+        </w:numPr>
+      </w:pPr>
+      <w:r>
+        <w:t xml:space="preserve">First possible error would be if a user tried to create a folder with an empty folder_name, and to handle that we would block the insert and display a message “Folders must be named.” Second possible error would be if a user tries to delete or update a folder that was already deleted. To handle that, we would count the rows </w:t>
+      </w:r>
+      <w:r>
+        <w:lastRenderedPageBreak/>
+        <w:t>affected by an update, and if it was 0, we would tell the user “This folder no longer exists.” Third possible error would be if the database got too large and a write failure occurred. We would handle this by catching the error and sending the message “Device storage is full. Unable to save card.”</w:t>
+      </w:r>
+    </w:p>
+    <w:p>
+      <w:pPr>
+        <w:pStyle w:val="ListParagraph"/>
+        <w:numPr>
+          <w:ilvl w:val="0"/>
+          <w:numId w:val="1"/>
+        </w:numPr>
+      </w:pPr>
+      <w:r>
+        <w:t>We use async and future for database operations because they can take time, and if they were synchronous, it would block execution for the rest of the app until the database returns. This would have a bad effect on user experience, if the database were slow, the app would be unresponsive. But by having asynchronous operations, we can run them in the background and keep the app responsive and show a loading spinner.</w:t>
+      </w:r>
+    </w:p>
+    <w:p>
+      <w:pPr>
+        <w:pStyle w:val="ListParagraph"/>
+        <w:numPr>
+          <w:ilvl w:val="0"/>
+          <w:numId w:val="1"/>
+        </w:numPr>
+      </w:pPr>
+      <w:r>
+        <w:t>setState works fine for this small app, but it tightly couples UI and business logic inside widget classes, making code hard to reuse, test in isolation, or share state across unrelated screens</w:t>
+      </w:r>
+      <w:r>
+        <w:t>.</w:t>
+      </w:r>
+      <w:r>
+        <w:t xml:space="preserve"> </w:t>
+      </w:r>
+      <w:r>
+        <w:t>F</w:t>
+      </w:r>
+      <w:r>
+        <w:t>or example, if deleting a folder on one screen needs to update a card count displayed elsewhere, setState has no built-in way to propagate that change. Provider is low-complexity and uses ChangeNotifier classes that separate logic from widgets, making it testable and scalable enough for medium apps, though deeply nested state can get verbose. BLoC enforces strict separation via streams and events, offering excellent testability and scalability for large apps, but adds significant boilerplate and a steeper learning curve for a project this size. Riverpod sits in the middle</w:t>
+      </w:r>
+      <w:r>
+        <w:t>. I</w:t>
+      </w:r>
+      <w:r>
+        <w:t>t removes the BuildContext dependency that Provider requires, supports compile-time safety, and keeps boilerplate minimal while remaining highly testable. For this card organizer app, I'd recommend Provider since the state is straightforward (folders and cards lists), the team is likely learning Flutter, and Provider is the officially recommended starting point that covers all current needs without overengineering.</w:t>
+      </w:r>
+    </w:p>
+    <w:p>
+      <w:pPr>
+        <w:pStyle w:val="ListParagraph"/>
+        <w:numPr>
+          <w:ilvl w:val="0"/>
+          <w:numId w:val="1"/>
+        </w:numPr>
+      </w:pPr>
+      <w:r>
+        <w:t>When the user confirms a folder deletion, immediately show a full-screen loading overlay or a modal CircularProgressIndicator dialog that is non-dismissible (barrierDismissible: false), preventing the user from tapping other buttons, navigating away, or triggering a second delete while the operation is in progress. All interactive elements behind the overlay</w:t>
+      </w:r>
+      <w:r>
+        <w:t>-</w:t>
+      </w:r>
+      <w:r>
+        <w:t xml:space="preserve"> the back button, other folder cards, and the delete buttons</w:t>
+      </w:r>
+      <w:r>
+        <w:t>-</w:t>
+      </w:r>
+      <w:r>
+        <w:t xml:space="preserve"> are effectively disabled since the modal blocks all input. Once the delete completes successfully, dismiss the loading dialog, show a SnackBar confirming "Hearts folder and all 13 cards deleted," and refresh the folder list; if it fails, dismiss the loader and show an error SnackBar like "Delete failed</w:t>
+      </w:r>
+      <w:r>
+        <w:t>.</w:t>
+      </w:r>
+      <w:r>
+        <w:t xml:space="preserve"> </w:t>
+      </w:r>
+      <w:r>
+        <w:t>Y</w:t>
+      </w:r>
+      <w:r>
+        <w:t xml:space="preserve">our data is unchanged, please try again." As a recovery path, the SnackBar on success could include an "Undo" action with a short timer that re-inserts the folder and its cards from a temporary in-memory copy before the data is truly discarded. This approach </w:t>
+      </w:r>
+      <w:r>
+        <w:lastRenderedPageBreak/>
+        <w:t>covers all three concerns: visible progress (spinner), interruption prevention (non-dismissible modal), and safe navigation (UI stays on the folders screen throughout).</w:t>
       </w:r>
     </w:p>
     <w:sectPr>

</xml_diff>